<commit_message>
docs(kit): cohérence « 5 perturbations » (bloc canonique + créneau J3-bis)
- README.md + GUIDE-ETUDIANT.md : bloc canonique « 5 perturbations de la semaine »
  (tableau P1→P5, dont 2 le mercredi).
- .github/ISSUE_TEMPLATE/perturbation.md + docs/10-gestion-projet-github.md :
  « (J1…J4) » → « (J1, J2, J3, J3-bis, J4 — 5 perturbations) ».
- docs/etude-avant-projet/sources/3-etude-faisabilite.md : ajout du créneau
  J3-bis (RGPD / données personnelles, mercredi 14h00) au planning de la semaine,
  rendant visible le double créneau du mercredi. Docx régénéré en conséquence.
</commit_message>
<xml_diff>
--- a/docs/etude-avant-projet/docx/3-etude-faisabilite.docx
+++ b/docs/etude-avant-projet/docx/3-etude-faisabilite.docx
@@ -1441,7 +1441,7 @@
           <w:p>
             <w:r/>
             <w:r>
-              <w:t>J3 (mercredi)</w:t>
+              <w:t>J3 (mercredi 10h00)</w:t>
             </w:r>
           </w:p>
         </w:tc>
@@ -1464,6 +1464,41 @@
             <w:r/>
             <w:r>
               <w:t>Génération 10 QCM (F3), correction (F4), score (F5)</w:t>
+            </w:r>
+          </w:p>
+        </w:tc>
+      </w:tr>
+      <w:tr>
+        <w:tc>
+          <w:tcPr>
+            <w:tcW w:type="dxa" w:w="2880"/>
+          </w:tcPr>
+          <w:p>
+            <w:r/>
+            <w:r>
+              <w:t>J3-bis (mercredi 14h00)</w:t>
+            </w:r>
+          </w:p>
+        </w:tc>
+        <w:tc>
+          <w:tcPr>
+            <w:tcW w:type="dxa" w:w="2880"/>
+          </w:tcPr>
+          <w:p>
+            <w:r/>
+            <w:r>
+              <w:t>Réalisation — cœur (double créneau)</w:t>
+            </w:r>
+          </w:p>
+        </w:tc>
+        <w:tc>
+          <w:tcPr>
+            <w:tcW w:type="dxa" w:w="2880"/>
+          </w:tcPr>
+          <w:p>
+            <w:r/>
+            <w:r>
+              <w:t>RGPD / données personnelles (demande d'accès, souveraineté)</w:t>
             </w:r>
           </w:p>
         </w:tc>

</xml_diff>